<commit_message>
Improve Alder pilot tasks
</commit_message>
<xml_diff>
--- a/companies/alder-ridge/source-files/Shared/Finance/Corporate Development/Active analyses/IC diligence review notes - 7.5 DC.docx
+++ b/companies/alder-ridge/source-files/Shared/Finance/Corporate Development/Active analyses/IC diligence review notes - 7.5 DC.docx
@@ -241,7 +241,7 @@
                 <w:color w:val="000000"/>
                 <w:sz w:val="22"/>
               </w:rPr>
-              <w:t>QoE adjustment register, Redwood monthly P&amp;L, Remaining risk register</w:t>
+              <w:t>IC valuation assumptions, QoE adjustment evidence, Redwood monthly P&amp;L, Remaining risk register</w:t>
             </w:r>
           </w:p>
         </w:tc>
@@ -345,7 +345,7 @@
                 <w:color w:val="000000"/>
                 <w:sz w:val="22"/>
               </w:rPr>
-              <w:t>Estimated closing NWC, Historical normalized NWC, Purchase agreement</w:t>
+              <w:t>Closing eligibility condition, Diligence peg treatment, Estimated closing balance sheet, Historical normalized NWC, Purchase agreement</w:t>
             </w:r>
           </w:p>
         </w:tc>
@@ -1751,17 +1751,27 @@
     </w:p>
     <w:p>
       <w:r>
-        <w:t>Decision 1: Rebuild reported EBITDA from the twelve-month target P&amp;L before considering adjustments.</w:t>
+        <w:t>Decision 1: Rebuild LTM revenue and reported EBITDA from the twelve-month target P&amp;L before considering any seller adjustment.</w:t>
       </w:r>
     </w:p>
     <w:p>
       <w:r>
-        <w:t>Decision 2: Accept only diligence-supported, seller-period normalization items; buyer synergies and uncommitted future savings are rejected.</w:t>
+        <w:t>Decision 2: Treat seller headline adjustments as proposals. Normalize owner compensation to evidenced market replacement cost, limit a settlement add-back to the net expense remaining after recorded reimbursement, and restore replacement compensation for documented vacancy months.</w:t>
       </w:r>
     </w:p>
     <w:p>
       <w:r>
-        <w:t>Decision 3: Rank remaining QoE risks by probability-weighted EBITDA impact after normalization.</w:t>
+        <w:t>Decision 3: Exclude buyer-controlled benefits with no target-period realization and facility savings without an executed reduction in the target's obligation.</w:t>
+      </w:r>
+    </w:p>
+    <w:p>
+      <w:r>
+        <w:t>Decision 4: Reconcile the seller-adjusted case to supported normalized EBITDA and apply the working entry multiple to that EBITDA gap for the valuation implication.</w:t>
+      </w:r>
+    </w:p>
+    <w:p>
+      <w:r>
+        <w:t>Decision 5: Keep residual risks separate from normalized EBITDA. Rank each risk by probability times EBITDA impact, aggregate the three distinct expected impacts, and deduct that aggregate only for the risk-adjusted IC diagnostic.</w:t>
       </w:r>
     </w:p>
     <w:p>
@@ -1774,17 +1784,27 @@
     </w:p>
     <w:p>
       <w:r>
-        <w:t>Decision 1: Define operating NWC as trade AR plus inventory less trade AP, accrued operating liabilities, and deferred revenue.</w:t>
+        <w:t>Decision 1: Operating NWC includes undisputed trade receivables and inventory, less trade accounts payable, ordinary-course payroll and benefits accruals, warranty and service accruals, and customer deposits and deferred revenue.</w:t>
       </w:r>
     </w:p>
     <w:p>
       <w:r>
-        <w:t>Decision 2: Exclude the two documented seasonal-close months from the median peg; do not average them back in.</w:t>
+        <w:t>Decision 2: Exclude prepaid expenses, income-tax balances, intercompany balances, and disputed receivables from operating NWC. Treat seller transaction bonuses and capital expenditure accruals as debt-like and separately settled.</w:t>
       </w:r>
     </w:p>
     <w:p>
       <w:r>
-        <w:t>Decision 3: The collar absorbs the first portion of a shortfall; only the excess reduces purchase price.</w:t>
+        <w:t>Decision 3: Exclude December 2025 and January 2026 as documented seasonal-close distortions, then use the median of the remaining ten monthly NWC balances as the peg.</w:t>
+      </w:r>
+    </w:p>
+    <w:p>
+      <w:r>
+        <w:t>Decision 4: The 250,000 dollar collar absorbs the first portion of a closing NWC shortfall. Only the excess reduces purchase price dollar for dollar.</w:t>
+      </w:r>
+    </w:p>
+    <w:p>
+      <w:r>
+        <w:t>Decision 5: If signed customer acceptance is obtained before closing, the disputed change-order receivable qualifies as an undisputed trade receivable. Show that sensitivity and recommend obtaining the acceptance when it eliminates the purchase-price reduction.</w:t>
       </w:r>
     </w:p>
     <w:p>

</xml_diff>